<commit_message>
Add Arduino sketches; refactor map and models
Adds Arduino example sketches for GPS and IRS-180, and a new rules.md. Introduces nfu/lib/class.dart with ParkingLot and Esp32Data models plus Firestore/HTTP helper functions. Moves map, routing and marker UI from main.dart into a new map.dart and simplifies main.dart to a lightweight HomePage that navigates to MapPage. Removes main_test.dart and updates seed_firestore.dart to remove feePerHour from seeded records. Also updates a Word document binary.
</commit_message>
<xml_diff>
--- a/Smart NFU School/專題-虎科大智慧校園.docx
+++ b/Smart NFU School/專題-虎科大智慧校園.docx
@@ -776,7 +776,7 @@
         <w:rPr>
           <w:rFonts w:ascii="Times New Roman" w:eastAsia="DFKai-SB" w:hAnsi="Times New Roman" w:hint="eastAsia"/>
         </w:rPr>
-        <w:t>6</w:t>
+        <w:t>8</w:t>
       </w:r>
       <w:r>
         <w:rPr>
@@ -788,68 +788,6 @@
         <w:rPr>
           <w:rFonts w:ascii="Times New Roman" w:eastAsia="DFKai-SB" w:hAnsi="Times New Roman" w:hint="eastAsia"/>
         </w:rPr>
-        <w:t>太陽能板</w:t>
-      </w:r>
-    </w:p>
-    <w:p>
-      <w:pPr>
-        <w:rPr>
-          <w:rFonts w:ascii="Times New Roman" w:eastAsia="DFKai-SB" w:hAnsi="Times New Roman"/>
-        </w:rPr>
-      </w:pPr>
-      <w:r>
-        <w:rPr>
-          <w:rFonts w:ascii="Times New Roman" w:eastAsia="DFKai-SB" w:hAnsi="Times New Roman" w:hint="eastAsia"/>
-        </w:rPr>
-        <w:t>0</w:t>
-      </w:r>
-      <w:r>
-        <w:rPr>
-          <w:rFonts w:ascii="Times New Roman" w:eastAsia="DFKai-SB" w:hAnsi="Times New Roman" w:hint="eastAsia"/>
-        </w:rPr>
-        <w:t>7</w:t>
-      </w:r>
-      <w:r>
-        <w:rPr>
-          <w:rFonts w:ascii="Times New Roman" w:eastAsia="DFKai-SB" w:hAnsi="Times New Roman" w:hint="eastAsia"/>
-        </w:rPr>
-        <w:t xml:space="preserve">. </w:t>
-      </w:r>
-      <w:r>
-        <w:rPr>
-          <w:rFonts w:ascii="Times New Roman" w:eastAsia="DFKai-SB" w:hAnsi="Times New Roman" w:hint="eastAsia"/>
-        </w:rPr>
-        <w:t>螢幕</w:t>
-      </w:r>
-    </w:p>
-    <w:p>
-      <w:pPr>
-        <w:rPr>
-          <w:rFonts w:ascii="Times New Roman" w:eastAsia="DFKai-SB" w:hAnsi="Times New Roman"/>
-        </w:rPr>
-      </w:pPr>
-      <w:r>
-        <w:rPr>
-          <w:rFonts w:ascii="Times New Roman" w:eastAsia="DFKai-SB" w:hAnsi="Times New Roman" w:hint="eastAsia"/>
-        </w:rPr>
-        <w:t>0</w:t>
-      </w:r>
-      <w:r>
-        <w:rPr>
-          <w:rFonts w:ascii="Times New Roman" w:eastAsia="DFKai-SB" w:hAnsi="Times New Roman" w:hint="eastAsia"/>
-        </w:rPr>
-        <w:t>8</w:t>
-      </w:r>
-      <w:r>
-        <w:rPr>
-          <w:rFonts w:ascii="Times New Roman" w:eastAsia="DFKai-SB" w:hAnsi="Times New Roman" w:hint="eastAsia"/>
-        </w:rPr>
-        <w:t xml:space="preserve">. </w:t>
-      </w:r>
-      <w:r>
-        <w:rPr>
-          <w:rFonts w:ascii="Times New Roman" w:eastAsia="DFKai-SB" w:hAnsi="Times New Roman" w:hint="eastAsia"/>
-        </w:rPr>
         <w:t>GPS</w:t>
       </w:r>
     </w:p>
@@ -1307,58 +1245,58 @@
         <w:rPr>
           <w:rFonts w:ascii="Times New Roman" w:eastAsia="DFKai-SB" w:hAnsi="Times New Roman" w:hint="eastAsia"/>
         </w:rPr>
+        <w:t>二、</w:t>
+      </w:r>
+      <w:r>
+        <w:rPr>
+          <w:rFonts w:ascii="Times New Roman" w:eastAsia="DFKai-SB" w:hAnsi="Times New Roman" w:hint="eastAsia"/>
+        </w:rPr>
+        <w:t>關鍵字</w:t>
+      </w:r>
+    </w:p>
+    <w:p>
+      <w:pPr>
+        <w:rPr>
+          <w:rFonts w:ascii="Times New Roman" w:eastAsia="DFKai-SB" w:hAnsi="Times New Roman"/>
+        </w:rPr>
+      </w:pPr>
+      <w:r>
+        <w:rPr>
+          <w:rFonts w:ascii="Times New Roman" w:eastAsia="DFKai-SB" w:hAnsi="Times New Roman"/>
+        </w:rPr>
+        <w:t>虎科大、智慧校園、物聯網、</w:t>
+      </w:r>
+      <w:r>
+        <w:rPr>
+          <w:rFonts w:ascii="Times New Roman" w:eastAsia="DFKai-SB" w:hAnsi="Times New Roman" w:hint="eastAsia"/>
+        </w:rPr>
+        <w:t>智慧教室牌</w:t>
+      </w:r>
+      <w:r>
+        <w:rPr>
+          <w:rFonts w:ascii="Times New Roman" w:eastAsia="DFKai-SB" w:hAnsi="Times New Roman"/>
+        </w:rPr>
+        <w:t>、智慧停車場</w:t>
+      </w:r>
+    </w:p>
+    <w:p>
+      <w:pPr>
+        <w:rPr>
+          <w:rFonts w:ascii="Times New Roman" w:eastAsia="DFKai-SB" w:hAnsi="Times New Roman"/>
+        </w:rPr>
+      </w:pPr>
+    </w:p>
+    <w:p>
+      <w:pPr>
+        <w:rPr>
+          <w:rFonts w:ascii="Times New Roman" w:eastAsia="DFKai-SB" w:hAnsi="Times New Roman"/>
+        </w:rPr>
+      </w:pPr>
+      <w:r>
+        <w:rPr>
+          <w:rFonts w:ascii="Times New Roman" w:eastAsia="DFKai-SB" w:hAnsi="Times New Roman" w:hint="eastAsia"/>
+        </w:rPr>
         <w:lastRenderedPageBreak/>
-        <w:t>二、</w:t>
-      </w:r>
-      <w:r>
-        <w:rPr>
-          <w:rFonts w:ascii="Times New Roman" w:eastAsia="DFKai-SB" w:hAnsi="Times New Roman" w:hint="eastAsia"/>
-        </w:rPr>
-        <w:t>關鍵字</w:t>
-      </w:r>
-    </w:p>
-    <w:p>
-      <w:pPr>
-        <w:rPr>
-          <w:rFonts w:ascii="Times New Roman" w:eastAsia="DFKai-SB" w:hAnsi="Times New Roman"/>
-        </w:rPr>
-      </w:pPr>
-      <w:r>
-        <w:rPr>
-          <w:rFonts w:ascii="Times New Roman" w:eastAsia="DFKai-SB" w:hAnsi="Times New Roman"/>
-        </w:rPr>
-        <w:t>虎科大、智慧校園、物聯網、</w:t>
-      </w:r>
-      <w:r>
-        <w:rPr>
-          <w:rFonts w:ascii="Times New Roman" w:eastAsia="DFKai-SB" w:hAnsi="Times New Roman" w:hint="eastAsia"/>
-        </w:rPr>
-        <w:t>智慧教室牌</w:t>
-      </w:r>
-      <w:r>
-        <w:rPr>
-          <w:rFonts w:ascii="Times New Roman" w:eastAsia="DFKai-SB" w:hAnsi="Times New Roman"/>
-        </w:rPr>
-        <w:t>、智慧停車場</w:t>
-      </w:r>
-    </w:p>
-    <w:p>
-      <w:pPr>
-        <w:rPr>
-          <w:rFonts w:ascii="Times New Roman" w:eastAsia="DFKai-SB" w:hAnsi="Times New Roman"/>
-        </w:rPr>
-      </w:pPr>
-    </w:p>
-    <w:p>
-      <w:pPr>
-        <w:rPr>
-          <w:rFonts w:ascii="Times New Roman" w:eastAsia="DFKai-SB" w:hAnsi="Times New Roman"/>
-        </w:rPr>
-      </w:pPr>
-      <w:r>
-        <w:rPr>
-          <w:rFonts w:ascii="Times New Roman" w:eastAsia="DFKai-SB" w:hAnsi="Times New Roman" w:hint="eastAsia"/>
-        </w:rPr>
         <w:t>三、簡介</w:t>
       </w:r>
       <w:r>
@@ -1796,7 +1734,6 @@
         <w:rPr>
           <w:rFonts w:ascii="Times New Roman" w:eastAsia="DFKai-SB" w:hAnsi="Times New Roman"/>
         </w:rPr>
-        <w:lastRenderedPageBreak/>
         <w:t>建立紅外線感測停車系統</w:t>
       </w:r>
     </w:p>
@@ -1860,6 +1797,7 @@
         <w:rPr>
           <w:rFonts w:ascii="Times New Roman" w:eastAsia="DFKai-SB" w:hAnsi="Times New Roman"/>
         </w:rPr>
+        <w:lastRenderedPageBreak/>
         <w:t>整合與測試系統</w:t>
       </w:r>
     </w:p>

</xml_diff>